<commit_message>
Add documentation, audit record and ignore system files
</commit_message>
<xml_diff>
--- a/APPLE EXAMPLE/INDUSTRIAL CONTENT WORD FORMAT EACH CATEGORY LANDING PAGE  .docx
+++ b/APPLE EXAMPLE/INDUSTRIAL CONTENT WORD FORMAT EACH CATEGORY LANDING PAGE  .docx
@@ -412,8 +412,8 @@
           <w:noProof/>
           <w:kern w:val="0"/>
         </w:rPr>
-        <w:pict w14:anchorId="6F947BA8">
-          <v:rect id="_x0000_i1034" alt="" style="width:468pt;height:.05pt;mso-width-percent:0;mso-height-percent:0;mso-width-percent:0;mso-height-percent:0" o:hralign="center" o:hrstd="t" o:hr="t" fillcolor="#a0a0a0" stroked="f"/>
+        <w:pict w14:anchorId="1DCA077C">
+          <v:rect id="_x0000_i1033" alt="" style="width:468pt;height:.05pt;mso-width-percent:0;mso-height-percent:0;mso-width-percent:0;mso-height-percent:0" o:hralign="center" o:hrstd="t" o:hr="t" fillcolor="#a0a0a0" stroked="f"/>
         </w:pict>
       </w:r>
     </w:p>
@@ -803,11 +803,11 @@
       <w:r>
         <w:rPr>
           <w:rFonts w:ascii="Times New Roman" w:eastAsia="Times New Roman" w:hAnsi="Times New Roman" w:cs="Times New Roman"/>
-          <w:kern w:val="0"/>
-          <w14:ligatures w14:val="none"/>
-        </w:rPr>
-        <w:pict w14:anchorId="503D581D">
-          <v:rect id="_x0000_i1026" style="width:0;height:1.5pt" o:hralign="center" o:hrstd="t" o:hr="t" fillcolor="#a0a0a0" stroked="f"/>
+          <w:noProof/>
+          <w:kern w:val="0"/>
+        </w:rPr>
+        <w:pict w14:anchorId="4E6A3659">
+          <v:rect id="_x0000_i1032" alt="" style="width:468pt;height:.05pt;mso-width-percent:0;mso-height-percent:0;mso-width-percent:0;mso-height-percent:0" o:hralign="center" o:hrstd="t" o:hr="t" fillcolor="#a0a0a0" stroked="f"/>
         </w:pict>
       </w:r>
     </w:p>
@@ -1196,11 +1196,11 @@
       <w:r>
         <w:rPr>
           <w:rFonts w:ascii="Times New Roman" w:eastAsia="Times New Roman" w:hAnsi="Times New Roman" w:cs="Times New Roman"/>
-          <w:kern w:val="0"/>
-          <w14:ligatures w14:val="none"/>
-        </w:rPr>
-        <w:pict w14:anchorId="5C6A1E9C">
-          <v:rect id="_x0000_i1027" style="width:0;height:1.5pt" o:hralign="center" o:hrstd="t" o:hr="t" fillcolor="#a0a0a0" stroked="f"/>
+          <w:noProof/>
+          <w:kern w:val="0"/>
+        </w:rPr>
+        <w:pict w14:anchorId="69264233">
+          <v:rect id="_x0000_i1031" alt="" style="width:468pt;height:.05pt;mso-width-percent:0;mso-height-percent:0;mso-width-percent:0;mso-height-percent:0" o:hralign="center" o:hrstd="t" o:hr="t" fillcolor="#a0a0a0" stroked="f"/>
         </w:pict>
       </w:r>
     </w:p>
@@ -1568,11 +1568,11 @@
       <w:r>
         <w:rPr>
           <w:rFonts w:ascii="Times New Roman" w:eastAsia="Times New Roman" w:hAnsi="Times New Roman" w:cs="Times New Roman"/>
-          <w:kern w:val="0"/>
-          <w14:ligatures w14:val="none"/>
-        </w:rPr>
-        <w:pict w14:anchorId="6E252AD9">
-          <v:rect id="_x0000_i1028" style="width:0;height:1.5pt" o:hralign="center" o:hrstd="t" o:hr="t" fillcolor="#a0a0a0" stroked="f"/>
+          <w:noProof/>
+          <w:kern w:val="0"/>
+        </w:rPr>
+        <w:pict w14:anchorId="4A039AE7">
+          <v:rect id="_x0000_i1030" alt="" style="width:468pt;height:.05pt;mso-width-percent:0;mso-height-percent:0;mso-width-percent:0;mso-height-percent:0" o:hralign="center" o:hrstd="t" o:hr="t" fillcolor="#a0a0a0" stroked="f"/>
         </w:pict>
       </w:r>
     </w:p>
@@ -1940,11 +1940,11 @@
       <w:r>
         <w:rPr>
           <w:rFonts w:ascii="Times New Roman" w:eastAsia="Times New Roman" w:hAnsi="Times New Roman" w:cs="Times New Roman"/>
-          <w:kern w:val="0"/>
-          <w14:ligatures w14:val="none"/>
-        </w:rPr>
-        <w:pict w14:anchorId="22E9C16B">
-          <v:rect id="_x0000_i1029" style="width:0;height:1.5pt" o:hralign="center" o:hrstd="t" o:hr="t" fillcolor="#a0a0a0" stroked="f"/>
+          <w:noProof/>
+          <w:kern w:val="0"/>
+        </w:rPr>
+        <w:pict w14:anchorId="27832603">
+          <v:rect id="_x0000_i1029" alt="" style="width:468pt;height:.05pt;mso-width-percent:0;mso-height-percent:0;mso-width-percent:0;mso-height-percent:0" o:hralign="center" o:hrstd="t" o:hr="t" fillcolor="#a0a0a0" stroked="f"/>
         </w:pict>
       </w:r>
     </w:p>
@@ -2311,11 +2311,11 @@
       <w:r>
         <w:rPr>
           <w:rFonts w:ascii="Times New Roman" w:eastAsia="Times New Roman" w:hAnsi="Times New Roman" w:cs="Times New Roman"/>
-          <w:kern w:val="0"/>
-          <w14:ligatures w14:val="none"/>
-        </w:rPr>
-        <w:pict w14:anchorId="7CADDFA3">
-          <v:rect id="_x0000_i1030" style="width:0;height:1.5pt" o:hralign="center" o:hrstd="t" o:hr="t" fillcolor="#a0a0a0" stroked="f"/>
+          <w:noProof/>
+          <w:kern w:val="0"/>
+        </w:rPr>
+        <w:pict w14:anchorId="1AC4F3C2">
+          <v:rect id="_x0000_i1028" alt="" style="width:468pt;height:.05pt;mso-width-percent:0;mso-height-percent:0;mso-width-percent:0;mso-height-percent:0" o:hralign="center" o:hrstd="t" o:hr="t" fillcolor="#a0a0a0" stroked="f"/>
         </w:pict>
       </w:r>
     </w:p>
@@ -2683,11 +2683,11 @@
       <w:r>
         <w:rPr>
           <w:rFonts w:ascii="Times New Roman" w:eastAsia="Times New Roman" w:hAnsi="Times New Roman" w:cs="Times New Roman"/>
-          <w:kern w:val="0"/>
-          <w14:ligatures w14:val="none"/>
-        </w:rPr>
-        <w:pict w14:anchorId="35697224">
-          <v:rect id="_x0000_i1031" style="width:0;height:1.5pt" o:hralign="center" o:hrstd="t" o:hr="t" fillcolor="#a0a0a0" stroked="f"/>
+          <w:noProof/>
+          <w:kern w:val="0"/>
+        </w:rPr>
+        <w:pict w14:anchorId="3D5638B2">
+          <v:rect id="_x0000_i1027" alt="" style="width:468pt;height:.05pt;mso-width-percent:0;mso-height-percent:0;mso-width-percent:0;mso-height-percent:0" o:hralign="center" o:hrstd="t" o:hr="t" fillcolor="#a0a0a0" stroked="f"/>
         </w:pict>
       </w:r>
     </w:p>
@@ -3057,8 +3057,8 @@
           <w:noProof/>
           <w:kern w:val="0"/>
         </w:rPr>
-        <w:pict w14:anchorId="01D241C1">
-          <v:rect id="_x0000_i1033" alt="" style="width:468pt;height:.05pt;mso-width-percent:0;mso-height-percent:0;mso-width-percent:0;mso-height-percent:0" o:hralign="center" o:hrstd="t" o:hr="t" fillcolor="#a0a0a0" stroked="f"/>
+        <w:pict w14:anchorId="328FC2AB">
+          <v:rect id="_x0000_i1026" alt="" style="width:468pt;height:.05pt;mso-width-percent:0;mso-height-percent:0;mso-width-percent:0;mso-height-percent:0" o:hralign="center" o:hrstd="t" o:hr="t" fillcolor="#a0a0a0" stroked="f"/>
         </w:pict>
       </w:r>
     </w:p>
@@ -3429,8 +3429,8 @@
           <w:noProof/>
           <w:kern w:val="0"/>
         </w:rPr>
-        <w:pict w14:anchorId="67E2125F">
-          <v:rect id="_x0000_i1032" alt="" style="width:468pt;height:.05pt;mso-width-percent:0;mso-height-percent:0;mso-width-percent:0;mso-height-percent:0" o:hralign="center" o:hrstd="t" o:hr="t" fillcolor="#a0a0a0" stroked="f"/>
+        <w:pict w14:anchorId="5F9370BB">
+          <v:rect id="_x0000_i1025" alt="" style="width:468pt;height:.05pt;mso-width-percent:0;mso-height-percent:0;mso-width-percent:0;mso-height-percent:0" o:hralign="center" o:hrstd="t" o:hr="t" fillcolor="#a0a0a0" stroked="f"/>
         </w:pict>
       </w:r>
     </w:p>

</xml_diff>